<commit_message>
simplificando ingestao e documentacao do RA1
</commit_message>
<xml_diff>
--- a/docs/RA1_COVID_India_Preenchido.docx
+++ b/docs/RA1_COVID_India_Preenchido.docx
@@ -181,7 +181,7 @@
           <w:color w:val="000000"/>
           <w:sz w:val="18"/>
         </w:rPr>
-        <w:t>Este documento apresenta a ingestão, o diagnóstico e a preparação das três bases do projeto. A entrega inclui um notebook executado e CSVs tratados, prontos para as próximas etapas da disciplina.</w:t>
+        <w:t>Este documento explica como carregamos, conferimos e preparamos os dados. O notebook reúne o código e os resultados de cada etapa.</w:t>
       </w:r>
     </w:p>
     <w:p>
@@ -210,7 +210,7 @@
         <w:rPr>
           <w:color w:val="000000"/>
         </w:rPr>
-        <w:t>Preparamos registros históricos de casos, testagem e vacinação para permitir comparações posteriores entre estados e territórios da Índia.</w:t>
+        <w:t>O projeto usa dados históricos de casos, testes e vacinação na Índia.</w:t>
       </w:r>
     </w:p>
     <w:p>
@@ -229,7 +229,7 @@
         <w:rPr>
           <w:color w:val="000000"/>
         </w:rPr>
-        <w:t>Os arquivos registram aspectos diferentes da pandemia e apresentam lacunas, grafias territoriais inconsistentes e formatos distintos. Essas diferenças podem prejudicar comparações entre localidades e períodos. O projeto organiza os dados para que a equipe possa utilizá-los nas próximas análises sem confundir ausências com zero, doses com indivíduos ou totais nacionais com estaduais.</w:t>
+        <w:t>Os arquivos têm valores vazios, nomes de estados escritos de formas diferentes e datas em formatos distintos. Precisamos organizar essas informações antes de comparar os estados e os períodos nas próximas etapas.</w:t>
       </w:r>
     </w:p>
     <w:p>
@@ -248,7 +248,7 @@
         <w:rPr>
           <w:color w:val="000000"/>
         </w:rPr>
-        <w:t>O objetivo da RA1 é produzir três bases consistentes, mantendo a informação original e documentando suas limitações. A unidade de análise é o registro de um território em uma data, dentro de cada base. Casos abrangem 30/01/2020 a 11/08/2021; testes, 01/04/2020 a 10/08/2021; vacinação, 16/01/2021 a 16/08/2021. Não calculamos taxas, indicadores ou conclusões epidemiológicas nesta etapa.</w:t>
+        <w:t>Nosso objetivo é preparar as três bases sem perder informações. Cada registro corresponde a um território e uma data. Os períodos de cada arquivo estão na seção 2. Nesta RA1, não calculamos indicadores nem tiramos conclusões sobre a pandemia.</w:t>
       </w:r>
     </w:p>
     <w:p>
@@ -629,7 +629,7 @@
         <w:rPr>
           <w:color w:val="000000"/>
         </w:rPr>
-        <w:t>As bases possuem datas, territórios e medidas relacionadas às três perguntas. Entretanto, seus períodos e coberturas são diferentes. Há muitas ausências em nacionalidade, resultados de testes e recortes de vacinação. Por isso, as futuras análises devem selecionar campos e períodos com preenchimento suficiente. Nesta RA1, não fazemos junções entre as bases.</w:t>
+        <w:t>Temos datas, territórios e as medidas necessárias para investigar as perguntas. Porém, os períodos e o preenchimento variam entre as bases. As próximas análises precisam levar essas diferenças em conta.</w:t>
       </w:r>
     </w:p>
     <w:p>
@@ -658,7 +658,7 @@
         <w:rPr>
           <w:color w:val="000000"/>
         </w:rPr>
-        <w:t>Utilizamos três arquivos CSV históricos já disponíveis na raiz do projeto. A leitura é local e não depende de API ou atualização automática.</w:t>
+        <w:t>Lemos os três CSVs que já estão na raiz do projeto. Não há busca automática de dados na internet.</w:t>
       </w:r>
     </w:p>
     <w:p>
@@ -707,7 +707,7 @@
         <w:rPr>
           <w:color w:val="000000"/>
         </w:rPr>
-        <w:t>Arquivos fornecidos como provenientes de COVID-19 in India, de Sudalai Rajkumar, distribuído no Kaggle. Referência: https://www.kaggle.com/datasets/sudalairajkumar/covid19-in-india. A data e a versão do download não foram informadas. A origem primária específica de cada arquivo não foi confirmada.</w:t>
+        <w:t>Os arquivos foram fornecidos como parte de COVID-19 in India, de Sudalai Rajkumar, no Kaggle: https://www.kaggle.com/datasets/sudalairajkumar/covid19-in-india. A data e a versão do download e a origem primária de cada arquivo não foram confirmadas.</w:t>
       </w:r>
     </w:p>
     <w:p>
@@ -747,11 +747,11 @@
         <w:rPr>
           <w:color w:val="000000"/>
         </w:rPr>
-        <w:t>F1: 30/01/2020 a 11/08/2021; 40 categorias territoriais após padronização, incluindo registros não atribuídos.</w:t>
+        <w:t>F1: 30/01/2020 a 11/08/2021, com 40 categorias territoriais após a limpeza, incluindo registros sem estado definido.</w:t>
         <w:br/>
-        <w:t>F2: 01/04/2020 a 10/08/2021; 36 categorias territoriais.</w:t>
+        <w:t>F2: 01/04/2020 a 10/08/2021, com 36 categorias.</w:t>
         <w:br/>
-        <w:t>F3: 16/01/2021 a 16/08/2021; 37 categorias, incluindo o total nacional India.</w:t>
+        <w:t>F3: 16/01/2021 a 16/08/2021, com 37 categorias, incluindo o total da Índia.</w:t>
       </w:r>
     </w:p>
     <w:p>
@@ -768,7 +768,7 @@
         <w:rPr>
           <w:color w:val="000000"/>
         </w:rPr>
-        <w:t>A licença específica do snapshot local não foi confirmada. Os arquivos são utilizados como material histórico do projeto; a atribuição da fonte é mantida. A reprodução local não exige credenciais.</w:t>
+        <w:t>A licença dos arquivos recebidos não foi confirmada. O projeto informa a fonte e usa os arquivos locais, sem exigir senha.</w:t>
       </w:r>
     </w:p>
     <w:p>
@@ -787,7 +787,7 @@
         <w:rPr>
           <w:color w:val="000000"/>
         </w:rPr>
-        <w:t>F1 apoia P1 com confirmados, recuperados e óbitos. F2 apoia P2 com o total de amostras testadas. F3 apoia P3 com primeira e segunda doses. Os campos de indivíduos vacinados não são usados como substitutos de doses.</w:t>
+        <w:t>F1 apoia P1 com casos, recuperados e óbitos; F2 apoia P2 com amostras testadas; F3 apoia P3 com primeiras e segundas doses.</w:t>
       </w:r>
     </w:p>
     <w:p>
@@ -954,7 +954,7 @@
                 <w:color w:val="000000"/>
                 <w:sz w:val="18"/>
               </w:rPr>
-              <w:t>Manter os três CSVs originais na raiz ou enviá-los no Colab.</w:t>
+              <w:t>Manter os CSVs na raiz. No Colab, enviá-los pelo painel Arquivos antes de executar.</w:t>
             </w:r>
           </w:p>
         </w:tc>
@@ -1037,7 +1037,7 @@
                 <w:color w:val="000000"/>
                 <w:sz w:val="18"/>
               </w:rPr>
-              <w:t>pd.read_csv: dtype="string", keep_default_na=False, encoding="utf-8-sig"; separador vírgula.</w:t>
+              <w:t>Ler com pd.read_csv, como texto, mantendo os marcadores de ausência. Usar vírgula e UTF-8.</w:t>
             </w:r>
           </w:p>
         </w:tc>
@@ -1120,7 +1120,7 @@
                 <w:color w:val="000000"/>
                 <w:sz w:val="18"/>
               </w:rPr>
-              <w:t>Mostrar dimensões e três primeiras linhas de cada base; registrar hashes dos originais.</w:t>
+              <w:t>Mostrar a quantidade de linhas, colunas e as três primeiras linhas de cada base.</w:t>
             </w:r>
           </w:p>
         </w:tc>
@@ -1168,7 +1168,7 @@
         <w:rPr>
           <w:color w:val="000000"/>
         </w:rPr>
-        <w:t>Foram carregados 18.110 registros de casos, 16.336 de testes e 7.845 de vacinação. Os três originais permanecem na raiz. No Colab, o envio manual é solicitado quando faltam arquivos; no VS Code, o notebook procura na pasta atual ou na pasta acima. A célula de código 1 apresenta dimensões e amostras das três bases.</w:t>
+        <w:t>Carregamos as três bases com as quantidades indicadas acima. A célula C1 mostra o tamanho e as primeiras linhas de cada arquivo. No Colab, os CSVs devem ser enviados pelo painel Arquivos antes da execução. No VS Code, ficam na raiz do projeto.</w:t>
       </w:r>
     </w:p>
     <w:p>
@@ -1197,7 +1197,7 @@
         <w:rPr>
           <w:color w:val="000000"/>
         </w:rPr>
-        <w:t>O diagnóstico foi feito com os dados carregados e repetido após a preparação. As contagens abaixo são verificações de qualidade, não indicadores epidemiológicos.</w:t>
+        <w:t>Procuramos valores vazios, linhas repetidas e informações que precisassem de revisão.</w:t>
       </w:r>
     </w:p>
     <w:p>
@@ -1214,7 +1214,7 @@
         <w:rPr>
           <w:color w:val="000000"/>
         </w:rPr>
-        <w:t>Uma linha representa um registro de território e data em uma das três bases. Vacinação também inclui o agregado nacional India; casos incluem categorias não atribuídas.</w:t>
+        <w:t>Uma linha representa um território em uma data. Vacinação também contém o total da Índia, e casos inclui registros sem estado definido.</w:t>
       </w:r>
     </w:p>
     <w:p>
@@ -1231,7 +1231,7 @@
         <w:rPr>
           <w:color w:val="000000"/>
         </w:rPr>
-        <w:t>A chave final é state + date, dentro de cada base. source_row indica a linha do arquivo de origem, contando o cabeçalho como linha 1. state_original preserva o texto territorial recebido.</w:t>
+        <w:t>Dentro de cada base, estado e data identificam a linha. Depois da limpeza, essa combinação não se repete.</w:t>
       </w:r>
     </w:p>
     <w:p>
@@ -1290,7 +1290,7 @@
                 <w:color w:val="FFFFFF"/>
                 <w:sz w:val="18"/>
               </w:rPr>
-              <w:t>Atributo</w:t>
+              <w:t>Coluna</w:t>
             </w:r>
           </w:p>
         </w:tc>
@@ -1368,7 +1368,7 @@
                 <w:color w:val="FFFFFF"/>
                 <w:sz w:val="18"/>
               </w:rPr>
-              <w:t>Unidade ou domínio</w:t>
+              <w:t>Unidade ou valores</w:t>
             </w:r>
           </w:p>
         </w:tc>
@@ -1451,7 +1451,7 @@
                 <w:color w:val="000000"/>
                 <w:sz w:val="18"/>
               </w:rPr>
-              <w:t>Texto na leitura; AAAA-MM-DD ou DD/MM/AAAA</w:t>
+              <w:t>Texto; ano-mês-dia ou dia/mês/ano</w:t>
             </w:r>
           </w:p>
         </w:tc>
@@ -1586,7 +1586,7 @@
                 <w:color w:val="000000"/>
                 <w:sz w:val="18"/>
               </w:rPr>
-              <w:t>Estado, território, India ou categoria não atribuída</w:t>
+              <w:t>Estado, território, Índia ou não atribuído</w:t>
             </w:r>
           </w:p>
         </w:tc>
@@ -1669,7 +1669,7 @@
                 <w:color w:val="000000"/>
                 <w:sz w:val="18"/>
               </w:rPr>
-              <w:t>Texto na leitura; Int64 final</w:t>
+              <w:t>Inteiros após a limpeza</w:t>
             </w:r>
           </w:p>
         </w:tc>
@@ -1778,7 +1778,7 @@
                 <w:color w:val="000000"/>
                 <w:sz w:val="18"/>
               </w:rPr>
-              <w:t>Texto na leitura; Int64 final</w:t>
+              <w:t>Inteiros após a limpeza</w:t>
             </w:r>
           </w:p>
         </w:tc>
@@ -1887,7 +1887,7 @@
                 <w:color w:val="000000"/>
                 <w:sz w:val="18"/>
               </w:rPr>
-              <w:t>Texto na leitura; Int64 final</w:t>
+              <w:t>Inteiros após a limpeza</w:t>
             </w:r>
           </w:p>
         </w:tc>
@@ -1970,7 +1970,7 @@
                 <w:color w:val="000000"/>
                 <w:sz w:val="18"/>
               </w:rPr>
-              <w:t>Nacionalidade, imunizantes, sexo, idade, sessões e locais</w:t>
+              <w:t>Nacionalidade, vacinas, sexo, idade, sessões e locais</w:t>
             </w:r>
           </w:p>
         </w:tc>
@@ -2046,7 +2046,7 @@
           <w:color w:val="000000"/>
           <w:sz w:val="18"/>
         </w:rPr>
-        <w:t>A lista completa de atributos, com todas as colunas originais e preparadas, está em docs/data_dictionary.md. C1 a C9 indicam as células de código do notebook, na ordem de execução.</w:t>
+        <w:t>O dicionário completo está em docs/data_dictionary.md. C1 a C9 são as células de código do notebook, na ordem de execução.</w:t>
       </w:r>
     </w:p>
     <w:tbl>
@@ -2232,7 +2232,7 @@
                 <w:color w:val="000000"/>
                 <w:sz w:val="18"/>
               </w:rPr>
-              <w:t>Ausências por coluna, incluindo marcadores como "-".</w:t>
+              <w:t>Valores vazios, incluindo "-".</w:t>
             </w:r>
           </w:p>
         </w:tc>
@@ -2258,7 +2258,7 @@
                 <w:color w:val="000000"/>
                 <w:sz w:val="18"/>
               </w:rPr>
-              <w:t>Casos: 17.664 em cada campo de nacionalidade. Testes: 9.368 negativos e 10.674 positivos. Vacinação: 224 em cada campo central de doses; recortes têm lacunas maiores.</w:t>
+              <w:t>Casos: 17.664 em cada coluna de nacionalidade. Testes: 9.368 negativos e 10.674 positivos. Vacinação: 224 em cada coluna central de doses; mais lacunas nos recortes.</w:t>
             </w:r>
           </w:p>
         </w:tc>
@@ -2341,7 +2341,7 @@
                 <w:color w:val="000000"/>
                 <w:sz w:val="18"/>
               </w:rPr>
-              <w:t>Duplicatas idênticas e unicidade de território/data.</w:t>
+              <w:t>Linhas iguais e estado/data repetidos.</w:t>
             </w:r>
           </w:p>
         </w:tc>
@@ -2367,7 +2367,7 @@
                 <w:color w:val="000000"/>
                 <w:sz w:val="18"/>
               </w:rPr>
-              <w:t>Uma duplicata em testes; nenhuma nas outras bases. Após a preparação, zero chaves repetidas.</w:t>
+              <w:t>Uma linha idêntica em testes. Após a limpeza, nenhum estado/data repetido nas três bases.</w:t>
             </w:r>
           </w:p>
         </w:tc>
@@ -2450,7 +2450,7 @@
                 <w:color w:val="000000"/>
                 <w:sz w:val="18"/>
               </w:rPr>
-              <w:t>Datas válidas e contagens inteiras não negativas.</w:t>
+              <w:t>Datas e contagens válidas.</w:t>
             </w:r>
           </w:p>
         </w:tc>
@@ -2476,7 +2476,7 @@
                 <w:color w:val="000000"/>
                 <w:sz w:val="18"/>
               </w:rPr>
-              <w:t>Zero datas ou contagens inválidas nos arquivos atuais. Horas também puderam ser convertidas.</w:t>
+              <w:t>Nenhuma data ou contagem inválida. As horas também foram convertidas.</w:t>
             </w:r>
           </w:p>
         </w:tc>
@@ -2559,7 +2559,7 @@
                 <w:color w:val="000000"/>
                 <w:sz w:val="18"/>
               </w:rPr>
-              <w:t>Categorias territoriais e espaços.</w:t>
+              <w:t>Nomes de estados e espaços.</w:t>
             </w:r>
           </w:p>
         </w:tc>
@@ -2585,7 +2585,7 @@
                 <w:color w:val="000000"/>
                 <w:sz w:val="18"/>
               </w:rPr>
-              <w:t>433 registros de casos com grafias corrigidas. Cabeçalhos com espaços também foram padronizados.</w:t>
+              <w:t>433 registros de casos com grafias corrigidas; cabeçalhos também foram padronizados.</w:t>
             </w:r>
           </w:p>
         </w:tc>
@@ -2668,7 +2668,7 @@
                 <w:color w:val="000000"/>
                 <w:sz w:val="18"/>
               </w:rPr>
-              <w:t>Quedas de acumulados e relações entre campos.</w:t>
+              <w:t>Quedas dos totais e diferenças entre colunas.</w:t>
             </w:r>
           </w:p>
         </w:tc>
@@ -2694,7 +2694,7 @@
                 <w:color w:val="000000"/>
                 <w:sz w:val="18"/>
               </w:rPr>
-              <w:t>52 quedas em casos, 23 em testes e 124 em vacinação. Sete ocorrências de divergência em regras de casos; nenhuma nas regras de doses. Uma linha pode violar mais de uma regra.</w:t>
+              <w:t>52 quedas em casos, 23 em testes e 124 em vacinação. Sete alertas nas regras de casos e nenhum nas doses. Uma linha pode gerar mais de um alerta.</w:t>
             </w:r>
           </w:p>
         </w:tc>
@@ -2777,7 +2777,7 @@
                 <w:color w:val="000000"/>
                 <w:sz w:val="18"/>
               </w:rPr>
-              <w:t>Mínimos e máximos por medida.</w:t>
+              <w:t>Valores mínimos e máximos.</w:t>
             </w:r>
           </w:p>
         </w:tc>
@@ -2803,7 +2803,7 @@
                 <w:color w:val="000000"/>
                 <w:sz w:val="18"/>
               </w:rPr>
-              <w:t>Extremos exibidos para revisão. Nenhuma exclusão: valores elevados não comprovam erro em séries acumuladas de territórios diferentes.</w:t>
+              <w:t>Exibidos para revisão. Um valor alto, sozinho, não justifica excluir a linha.</w:t>
             </w:r>
           </w:p>
         </w:tc>
@@ -2851,7 +2851,7 @@
         <w:rPr>
           <w:color w:val="000000"/>
         </w:rPr>
-        <w:t>As ausências limitam a comparação entre estados e períodos, principalmente nos recortes de vacinação e nos resultados de testes. A duplicata pode repetir uma contagem; grafias diferentes podem separar registros do mesmo estado. Priorizamos unicidade, nomes e tipos. Quedas e divergências são mantidas como alertas, pois corrigi-las sem evidência poderia modificar os boletins.</w:t>
+        <w:t>Valores vazios limitam as comparações. Linhas repetidas podem contar o mesmo dado duas vezes, e grafias diferentes podem separar registros do mesmo estado. Corrigimos esses problemas sem estimar valores para as informações que faltam.</w:t>
       </w:r>
     </w:p>
     <w:p>
@@ -2880,7 +2880,7 @@
         <w:rPr>
           <w:color w:val="000000"/>
         </w:rPr>
-        <w:t>Cada tratamento corresponde a um problema observado. Mantivemos todas as variáveis e evitamos preenchimentos ou correções estimadas.</w:t>
+        <w:t>Fizemos apenas os tratamentos necessários para organizar os dados.</w:t>
       </w:r>
     </w:p>
     <w:p>
@@ -2924,7 +2924,7 @@
         <w:rPr>
           <w:color w:val="000000"/>
         </w:rPr>
-        <w:t>D1 / Q2: uma linha idêntica em testes, de Uttar Pradesh em 05/04/2020. D2 / Q4: grafias como Karanataka, Himanchal Pradesh e Telengana, além de asteriscos e espaços. D3 / Q3: datas em dois formatos, horas e contagens lidas como texto. D4 / Q1: valores ausentes. D5 / Q5 e Q6: quedas, divergências e extremos.</w:t>
+        <w:t>As decisões abaixo tratam dos problemas Q1 a Q6: linhas repetidas, grafias diferentes, formatos de datas e números, valores vazios e alertas nos totais.</w:t>
       </w:r>
     </w:p>
     <w:p>
@@ -2943,7 +2943,7 @@
         <w:rPr>
           <w:color w:val="000000"/>
         </w:rPr>
-        <w:t>D1: removemos somente a repetição idêntica. D2: aplicamos um mapa explícito de nomes e preservamos os territórios históricos. D3: padronizamos datas e horas e convertemos contagens para Int64 anulável, sem arredondar. D4: mantivemos ausências, sem trocar por zero ou interpolar. D5: preservamos quedas, divergências e extremos, pois não há justificativa para estimar correções. Acrescentamos source_row, state_original e geographic_level para rastrear a origem e distinguir níveis geográficos.</w:t>
+        <w:t>Removemos apenas a linha idêntica e corrigimos as grafias conhecidas. Datas, horas e contagens receberam formatos iguais em cada coluna. Não preenchemos vazios com zero e não corrigimos quedas ou valores altos por estimativa. Os territórios históricos continuam separados.</w:t>
       </w:r>
     </w:p>
     <w:p>
@@ -2960,7 +2960,7 @@
         <w:rPr>
           <w:color w:val="000000"/>
         </w:rPr>
-        <w:t>notebooks/ra1.ipynb, C4: duplicatas, nomes e metadados; C5: datas, chaves e contagens; C6: horas e ordenação; C7: alertas; C8: verificações finais.</w:t>
+        <w:t>notebooks/ra1.ipynb: C4 trata repetições e nomes; C5 converte datas e números; C6 organiza horas e linhas; C7 mostra alertas; C8 confere o resultado.</w:t>
       </w:r>
     </w:p>
     <w:p>
@@ -2979,7 +2979,7 @@
         <w:rPr>
           <w:color w:val="000000"/>
         </w:rPr>
-        <w:t>As bases finais não possuem chaves ausentes ou repetidas. A única exclusão foi a duplicata de testes. As ausências por coluna, as 199 quedas de acumulados e as 7 ocorrências de divergência entre campos foram preservadas. Os três CSVs coincidem byte a byte com os resultados anteriores. Evidências: C8 e reports/validation.json.</w:t>
+        <w:t>Apenas uma linha foi removida: o registro repetido de testes de Uttar Pradesh em 05/04/2020. Nenhuma base terminou com estado/data repetidos ou vazios. As ausências e os alertas foram mantidos. Evidências: C8 e reports/validation.json.</w:t>
       </w:r>
     </w:p>
     <w:p>
@@ -3173,7 +3173,7 @@
                 <w:color w:val="000000"/>
                 <w:sz w:val="18"/>
               </w:rPr>
-              <w:t>Remover a duplicata idêntica.</w:t>
+              <w:t>Remover a linha idêntica.</w:t>
             </w:r>
           </w:p>
         </w:tc>
@@ -3282,7 +3282,7 @@
                 <w:color w:val="000000"/>
                 <w:sz w:val="18"/>
               </w:rPr>
-              <w:t>Padronizar nomes e distinguir níveis geográficos.</w:t>
+              <w:t>Corrigir nomes e indicar o tipo de território.</w:t>
             </w:r>
           </w:p>
         </w:tc>
@@ -3417,7 +3417,7 @@
                 <w:color w:val="000000"/>
                 <w:sz w:val="18"/>
               </w:rPr>
-              <w:t>Datas ISO, horas HH:MM:SS e contagens Int64; sem arredondamento.</w:t>
+              <w:t>Datas AAAA-MM-DD, horas HH:MM:SS e números inteiros, sem arredondar.</w:t>
             </w:r>
           </w:p>
         </w:tc>
@@ -3500,7 +3500,7 @@
                 <w:color w:val="000000"/>
                 <w:sz w:val="18"/>
               </w:rPr>
-              <w:t>Manter ausências.</w:t>
+              <w:t>Manter valores vazios.</w:t>
             </w:r>
           </w:p>
         </w:tc>
@@ -3609,7 +3609,7 @@
                 <w:color w:val="000000"/>
                 <w:sz w:val="18"/>
               </w:rPr>
-              <w:t>Preservar alertas e extremos.</w:t>
+              <w:t>Manter quedas, diferenças e extremos.</w:t>
             </w:r>
           </w:p>
         </w:tc>
@@ -3635,7 +3635,7 @@
                 <w:color w:val="000000"/>
                 <w:sz w:val="18"/>
               </w:rPr>
-              <w:t>199 quedas e 7 ocorrências entre campos mantidas.</w:t>
+              <w:t>199 quedas e 7 alertas entre colunas mantidos.</w:t>
             </w:r>
           </w:p>
         </w:tc>
@@ -3693,7 +3693,7 @@
         <w:rPr>
           <w:color w:val="000000"/>
         </w:rPr>
-        <w:t>As saídas mantêm as três bases separadas e todas as variáveis da fonte. Os nomes das colunas foram padronizados para facilitar o uso com Pandas.</w:t>
+        <w:t>As três bases continuam separadas e mantêm todas as colunas da fonte.</w:t>
       </w:r>
     </w:p>
     <w:p>
@@ -3710,7 +3710,7 @@
         <w:rPr>
           <w:color w:val="000000"/>
         </w:rPr>
-        <w:t>data/processed/casos.csv; data/processed/testes.csv; data/processed/vacinacao.csv. Formato CSV, UTF-8, vírgula, datas AAAA-MM-DD e ausências vazias.</w:t>
+        <w:t>data/processed/casos.csv; data/processed/testes.csv; data/processed/vacinacao.csv. São CSVs em UTF-8, separados por vírgulas, com datas AAAA-MM-DD e ausências vazias.</w:t>
       </w:r>
     </w:p>
     <w:p>
@@ -3727,7 +3727,7 @@
         <w:rPr>
           <w:color w:val="000000"/>
         </w:rPr>
-        <w:t>Um registro por território e data em cada base, ordenado por state, date e source_row.</w:t>
+        <w:t>Uma linha por território e data em cada base, ordenada por estado e data.</w:t>
       </w:r>
     </w:p>
     <w:p>
@@ -3744,7 +3744,7 @@
         <w:rPr>
           <w:color w:val="000000"/>
         </w:rPr>
-        <w:t>docs/data_dictionary.md, incluindo source_row, state_original e geographic_level.</w:t>
+        <w:t>docs/data_dictionary.md. As três colunas extras guardam a linha de origem (source_row), o nome original (state_original) e o nível geográfico (geographic_level).</w:t>
       </w:r>
     </w:p>
     <w:p>
@@ -3829,7 +3829,7 @@
                 <w:color w:val="FFFFFF"/>
                 <w:sz w:val="18"/>
               </w:rPr>
-              <w:t>Após ingestão</w:t>
+              <w:t>Antes da limpeza</w:t>
             </w:r>
           </w:p>
         </w:tc>
@@ -3855,7 +3855,7 @@
                 <w:color w:val="FFFFFF"/>
                 <w:sz w:val="18"/>
               </w:rPr>
-              <w:t>Após preparação</w:t>
+              <w:t>Depois da limpeza</w:t>
             </w:r>
           </w:p>
         </w:tc>
@@ -4239,7 +4239,7 @@
                 <w:color w:val="000000"/>
                 <w:sz w:val="18"/>
               </w:rPr>
-              <w:t>Atributos: casos / testes / vacinação</w:t>
+              <w:t>Colunas: casos / testes / vacinação</w:t>
             </w:r>
           </w:p>
         </w:tc>
@@ -4317,7 +4317,7 @@
                 <w:color w:val="000000"/>
                 <w:sz w:val="18"/>
               </w:rPr>
-              <w:t>Três metadados adicionados por base.</w:t>
+              <w:t>Três colunas extras por base.</w:t>
             </w:r>
           </w:p>
         </w:tc>
@@ -4348,7 +4348,7 @@
                 <w:color w:val="000000"/>
                 <w:sz w:val="18"/>
               </w:rPr>
-              <w:t>Duplicatas idênticas removíveis</w:t>
+              <w:t>Linhas idênticas repetidas</w:t>
             </w:r>
           </w:p>
         </w:tc>
@@ -4457,7 +4457,7 @@
                 <w:color w:val="000000"/>
                 <w:sz w:val="18"/>
               </w:rPr>
-              <w:t>Chaves repetidas</w:t>
+              <w:t>Estado/data repetidos</w:t>
             </w:r>
           </w:p>
         </w:tc>
@@ -4535,7 +4535,7 @@
                 <w:color w:val="000000"/>
                 <w:sz w:val="18"/>
               </w:rPr>
-              <w:t>Unicidade de state + date.</w:t>
+              <w:t>Uma linha por estado e data.</w:t>
             </w:r>
           </w:p>
         </w:tc>
@@ -4566,7 +4566,7 @@
                 <w:color w:val="000000"/>
                 <w:sz w:val="18"/>
               </w:rPr>
-              <w:t>Ausências nas variáveis originais</w:t>
+              <w:t>Valores vazios nas colunas originais</w:t>
             </w:r>
           </w:p>
         </w:tc>
@@ -4644,7 +4644,7 @@
                 <w:color w:val="000000"/>
                 <w:sz w:val="18"/>
               </w:rPr>
-              <w:t>Lacunas preservadas, sem imputação.</w:t>
+              <w:t>Sem preencher ou estimar valores.</w:t>
             </w:r>
           </w:p>
         </w:tc>
@@ -4666,7 +4666,7 @@
         <w:rPr>
           <w:color w:val="000000"/>
         </w:rPr>
-        <w:t>Verificamos chaves não nulas e únicas, contagens Int64 não negativas, datas e horas válidas e a reconciliação entre entradas, saídas e duplicatas removidas. A releitura dos CSVs foi testada. As ausências permaneceram iguais às anteriores e os hashes SHA-256 confirmaram a preservação dos originais. Sete cenários de entradas inválidas foram bloqueados antes da exportação; um teste adicional confirmou precisão para um inteiro acima de 2⁵³. Evidências: C8 e reports/validation.json.</w:t>
+        <w:t>Conferimos estado e data, repetições, datas válidas, contagens inteiras não negativas e o total de linhas antes e depois da limpeza. Também testamos a leitura dos CSVs salvos. O notebook terminou sem erros e os dados originais foram preservados. Evidências: C8 e reports/validation.json.</w:t>
       </w:r>
     </w:p>
     <w:p>
@@ -4685,7 +4685,7 @@
         <w:rPr>
           <w:color w:val="000000"/>
         </w:rPr>
-        <w:t>Permanecem lacunas, diferenças de cobertura e revisões dos boletins. Não somar acumulados entre datas nem India aos estados; não misturar doses, indivíduos e amostras. Totais absolutos não representam taxas populacionais. O notebook foi testado em kernels locais; a interface do VS Code e uma sessão real do Colab não foram validadas. A versão e a licença do snapshot continuam não confirmadas.</w:t>
+        <w:t>Ainda há valores vazios e diferenças de cobertura. Não somar acumulados entre datas nem o total da Índia aos estados. Doses, pessoas e amostras são medidas diferentes. Valores absolutos não são taxas populacionais. A versão e a licença dos arquivos recebidos não foram confirmadas.</w:t>
       </w:r>
     </w:p>
     <w:p>
@@ -4714,7 +4714,7 @@
         <w:rPr>
           <w:color w:val="000000"/>
         </w:rPr>
-        <w:t>O fluxo é concentrado em notebooks/ra1.ipynb e depende apenas dos três CSVs originais. Não exige scripts externos nem saídas de uma execução anterior.</w:t>
+        <w:t>Toda a preparação está no notebook. Para executar, basta ter os três CSVs originais e o ambiente Python.</w:t>
       </w:r>
     </w:p>
     <w:p>
@@ -4731,8 +4731,7 @@
         <w:rPr>
           <w:color w:val="000000"/>
         </w:rPr>
-        <w:t>https://github.com/bbymicka/RA1-Data-Analytics • Branch: main. Primeiro commit: subindo o projeto. Os hashes dos arquivos estão em reports/validation.json.</w:t>
-        <w:t/>
+        <w:t>https://github.com/bbymicka/RA1-Data-Analytics • Branch: main. Primeiro commit: subindo o projeto.</w:t>
       </w:r>
     </w:p>
     <w:p>
@@ -4749,7 +4748,7 @@
         <w:rPr>
           <w:color w:val="000000"/>
         </w:rPr>
-        <w:t>Python 3.12.14 e Pandas 3.0.1 na validação. requirements.txt fixa pandas==3.0.1 e ipykernel==7.3.0 para execução local. A preparação usa Pandas e biblioteca padrão.</w:t>
+        <w:t>Python 3.12.14 e Pandas 3.0.1 na validação. requirements.txt lista Pandas 3.0.1 e ipykernel 7.3.0; este último permite executar o notebook no VS Code.</w:t>
       </w:r>
     </w:p>
     <w:p>
@@ -4806,7 +4805,7 @@
                 <w:color w:val="FFFFFF"/>
                 <w:sz w:val="18"/>
               </w:rPr>
-              <w:t>Artefato</w:t>
+              <w:t>Arquivo</w:t>
             </w:r>
           </w:p>
         </w:tc>
@@ -5003,7 +5002,7 @@
                 <w:color w:val="000000"/>
                 <w:sz w:val="18"/>
               </w:rPr>
-              <w:t>data/processed/casos.csv; testes.csv; vacinacao.csv.</w:t>
+              <w:t>Pasta data/processed: casos.csv, testes.csv e vacinacao.csv.</w:t>
             </w:r>
           </w:p>
         </w:tc>
@@ -5091,7 +5090,7 @@
                 <w:color w:val="000000"/>
                 <w:sz w:val="18"/>
               </w:rPr>
-              <w:t>Evidências de validação</w:t>
+              <w:t>Registro da validação</w:t>
             </w:r>
           </w:p>
         </w:tc>
@@ -5372,7 +5371,7 @@
                 <w:color w:val="000000"/>
                 <w:sz w:val="18"/>
               </w:rPr>
-              <w:t>Manter os três CSVs originais na raiz. No Colab, abrir o .ipynb e enviar os CSVs quando solicitado.</w:t>
+              <w:t>Manter os três CSVs na raiz. No Colab, enviar os arquivos pelo painel Arquivos antes de executar o notebook.</w:t>
             </w:r>
           </w:p>
         </w:tc>
@@ -5586,7 +5585,7 @@
         <w:rPr>
           <w:color w:val="000000"/>
         </w:rPr>
-        <w:t>Em 14/10/2026, a validação automatizada executou as nove células de código em três kernels novos: pela raiz sem saídas anteriores, pela pasta notebooks sem saídas anteriores e repetindo sobre resultados existentes. Todas terminaram sem erros. A comparação de todas as células e dos hashes confirmou igualdade dos CSVs com a versão anterior. O notebook foi salvo com as saídas. Ambiente: Python 3.12.14 e Pandas 3.0.1; registro em reports/validation.json.</w:t>
+        <w:t>Em 15/10/2026, executamos as nove células em três ambientes Python novos: pela raiz, pela pasta notebooks e repetindo a execução. Todas terminaram sem erros, com os mesmos resultados preparados. As saídas foram salvas no notebook. O registro está em reports/validation.json. A interface do VS Code e uma sessão real do Colab não foram testadas.</w:t>
       </w:r>
     </w:p>
     <w:p>
@@ -5615,7 +5614,7 @@
         <w:rPr>
           <w:color w:val="000000"/>
         </w:rPr>
-        <w:t>As referências e os anexos abaixo identificam a fonte informada e os arquivos que permitem conferir a entrega.</w:t>
+        <w:t>Estes materiais permitem consultar a fonte e conferir o trabalho.</w:t>
       </w:r>
     </w:p>
     <w:p>
@@ -5639,7 +5638,7 @@
         <w:rPr>
           <w:color w:val="000000"/>
         </w:rPr>
-        <w:t>NASCIMENTO, Richard Mickaell Santos; SOUSA, Edmund Soares de; AGOSTINI, Marco Alija Ramos. Preparação de dados de COVID-19 na Índia. Artefatos do projeto: notebooks/ra1.ipynb; README.md; docs/data_dictionary.md; reports/validation.json. Validação técnica registrada em 14 out. 2026.</w:t>
+        <w:t>NASCIMENTO, Richard Mickaell Santos; SOUSA, Edmund Soares de; AGOSTINI, Marco Alija Ramos. Preparação de dados de COVID-19 na Índia. Notebook e documentação do projeto, 2026. Disponível em: https://github.com/bbymicka/RA1-Data-Analytics.</w:t>
       </w:r>
     </w:p>
     <w:p>
@@ -5809,7 +5808,7 @@
                 <w:color w:val="000000"/>
                 <w:sz w:val="18"/>
               </w:rPr>
-              <w:t>Dicionário completo das variáveis e regras de releitura.</w:t>
+              <w:t>Descrição completa das colunas e de como reler os CSVs.</w:t>
             </w:r>
           </w:p>
         </w:tc>
@@ -5892,7 +5891,7 @@
                 <w:color w:val="000000"/>
                 <w:sz w:val="18"/>
               </w:rPr>
-              <w:t>Execuções, hashes, comparação e verificações de entradas inválidas.</w:t>
+              <w:t>Registro das execuções e das verificações finais.</w:t>
             </w:r>
           </w:p>
         </w:tc>
@@ -5975,7 +5974,7 @@
                 <w:color w:val="000000"/>
                 <w:sz w:val="18"/>
               </w:rPr>
-              <w:t>Código e saídas de todas as etapas. C1 a C9 são as células de código em ordem.</w:t>
+              <w:t>Código e resultados de cada etapa.</w:t>
             </w:r>
           </w:p>
         </w:tc>

</xml_diff>